<commit_message>
fix dialog-view-schedule dark mode
</commit_message>
<xml_diff>
--- a/frontend/src/assets/docs/LETTER RESCHEDULE TEMPLATE.docx
+++ b/frontend/src/assets/docs/LETTER RESCHEDULE TEMPLATE.docx
@@ -154,6 +154,30 @@
       </w:r>
       <w:r>
         <w:t xml:space="preserve"> is acceptable and will be adhered to.</w:t>
+      </w:r>
+    </w:p>
+    <w:p>
+      <w:pPr>
+        <w:ind w:firstLine="720"/>
+        <w:jc w:val="both"/>
+      </w:pPr>
+    </w:p>
+    <w:p>
+      <w:pPr>
+        <w:ind w:firstLine="720"/>
+        <w:jc w:val="both"/>
+        <w:rPr>
+          <w:u w:val="single"/>
+        </w:rPr>
+      </w:pPr>
+      <w:r>
+        <w:t xml:space="preserve">This request is made for the reason of </w:t>
+      </w:r>
+      <w:r>
+        <w:rPr>
+          <w:u w:val="single"/>
+        </w:rPr>
+        <w:t>_____[ simply state the reason of changing the schedule ]______________.</w:t>
       </w:r>
     </w:p>
     <w:p>
@@ -235,16 +259,7 @@
                 <w:sz w:val="20"/>
                 <w:szCs w:val="20"/>
               </w:rPr>
-              <w:t xml:space="preserve">Class </w:t>
-            </w:r>
-            <w:r>
-              <w:rPr>
-                <w:b/>
-                <w:bCs/>
-                <w:sz w:val="20"/>
-                <w:szCs w:val="20"/>
-              </w:rPr>
-              <w:t>President</w:t>
+              <w:t>Class President</w:t>
             </w:r>
           </w:p>
           <w:p>
@@ -2487,6 +2502,7 @@
   <w:style w:type="character" w:default="1" w:styleId="DefaultParagraphFont">
     <w:name w:val="Default Paragraph Font"/>
     <w:uiPriority w:val="1"/>
+    <w:semiHidden/>
     <w:unhideWhenUsed/>
   </w:style>
   <w:style w:type="table" w:default="1" w:styleId="TableNormal">

</xml_diff>